<commit_message>
clase(Fundamentos_Configuracion_Inicial_Servicios): Se ha modificado el fichero de la tarea 1.2
</commit_message>
<xml_diff>
--- a/Fundamentos_Configuracion_Inicial_Servicios/T1 - Fundamentos y aquitectura cloud/fci_t1.2_ripoll_cones.docx
+++ b/Fundamentos_Configuracion_Inicial_Servicios/T1 - Fundamentos y aquitectura cloud/fci_t1.2_ripoll_cones.docx
@@ -1341,7 +1341,7 @@
               <w:r>
                 <w:fldChar w:fldCharType="separate"/>
               </w:r>
-              <w:hyperlink w:anchor="_Toc243227914" w:history="1">
+              <w:hyperlink w:anchor="_Toc243736288" w:history="1">
                 <w:r>
                   <w:rPr>
                     <w:rStyle w:val="Hipervnculo"/>
@@ -1369,7 +1369,7 @@
                     <w:noProof/>
                     <w:webHidden/>
                   </w:rPr>
-                  <w:instrText xml:space="preserve"> PAGEREF _Toc243227914 \h </w:instrText>
+                  <w:instrText xml:space="preserve"> PAGEREF _Toc243736288 \h </w:instrText>
                 </w:r>
                 <w:r>
                   <w:rPr>
@@ -1412,7 +1412,7 @@
                   <w:lang w:eastAsia="es-ES"/>
                 </w:rPr>
               </w:pPr>
-              <w:hyperlink w:anchor="_Toc243227915" w:history="1">
+              <w:hyperlink w:anchor="_Toc243736289" w:history="1">
                 <w:r>
                   <w:rPr>
                     <w:rStyle w:val="Hipervnculo"/>
@@ -1440,7 +1440,7 @@
                     <w:noProof/>
                     <w:webHidden/>
                   </w:rPr>
-                  <w:instrText xml:space="preserve"> PAGEREF _Toc243227915 \h </w:instrText>
+                  <w:instrText xml:space="preserve"> PAGEREF _Toc243736289 \h </w:instrText>
                 </w:r>
                 <w:r>
                   <w:rPr>
@@ -1483,7 +1483,7 @@
                   <w:lang w:eastAsia="es-ES"/>
                 </w:rPr>
               </w:pPr>
-              <w:hyperlink w:anchor="_Toc243227916" w:history="1">
+              <w:hyperlink w:anchor="_Toc243736290" w:history="1">
                 <w:r>
                   <w:rPr>
                     <w:rStyle w:val="Hipervnculo"/>
@@ -1511,7 +1511,7 @@
                     <w:noProof/>
                     <w:webHidden/>
                   </w:rPr>
-                  <w:instrText xml:space="preserve"> PAGEREF _Toc243227916 \h </w:instrText>
+                  <w:instrText xml:space="preserve"> PAGEREF _Toc243736290 \h </w:instrText>
                 </w:r>
                 <w:r>
                   <w:rPr>
@@ -1554,7 +1554,7 @@
                   <w:lang w:eastAsia="es-ES"/>
                 </w:rPr>
               </w:pPr>
-              <w:hyperlink w:anchor="_Toc243227917" w:history="1">
+              <w:hyperlink w:anchor="_Toc243736291" w:history="1">
                 <w:r>
                   <w:rPr>
                     <w:rStyle w:val="Hipervnculo"/>
@@ -1582,7 +1582,7 @@
                     <w:noProof/>
                     <w:webHidden/>
                   </w:rPr>
-                  <w:instrText xml:space="preserve"> PAGEREF _Toc243227917 \h </w:instrText>
+                  <w:instrText xml:space="preserve"> PAGEREF _Toc243736291 \h </w:instrText>
                 </w:r>
                 <w:r>
                   <w:rPr>
@@ -1625,7 +1625,7 @@
                   <w:lang w:eastAsia="es-ES"/>
                 </w:rPr>
               </w:pPr>
-              <w:hyperlink w:anchor="_Toc243227918" w:history="1">
+              <w:hyperlink w:anchor="_Toc243736292" w:history="1">
                 <w:r>
                   <w:rPr>
                     <w:rStyle w:val="Hipervnculo"/>
@@ -1653,7 +1653,7 @@
                     <w:noProof/>
                     <w:webHidden/>
                   </w:rPr>
-                  <w:instrText xml:space="preserve"> PAGEREF _Toc243227918 \h </w:instrText>
+                  <w:instrText xml:space="preserve"> PAGEREF _Toc243736292 \h </w:instrText>
                 </w:r>
                 <w:r>
                   <w:rPr>
@@ -1696,7 +1696,7 @@
                   <w:lang w:eastAsia="es-ES"/>
                 </w:rPr>
               </w:pPr>
-              <w:hyperlink w:anchor="_Toc243227919" w:history="1">
+              <w:hyperlink w:anchor="_Toc243736293" w:history="1">
                 <w:r>
                   <w:rPr>
                     <w:rStyle w:val="Hipervnculo"/>
@@ -1724,7 +1724,7 @@
                     <w:noProof/>
                     <w:webHidden/>
                   </w:rPr>
-                  <w:instrText xml:space="preserve"> PAGEREF _Toc243227919 \h </w:instrText>
+                  <w:instrText xml:space="preserve"> PAGEREF _Toc243736293 \h </w:instrText>
                 </w:r>
                 <w:r>
                   <w:rPr>
@@ -1767,7 +1767,7 @@
                   <w:lang w:eastAsia="es-ES"/>
                 </w:rPr>
               </w:pPr>
-              <w:hyperlink w:anchor="_Toc243227920" w:history="1">
+              <w:hyperlink w:anchor="_Toc243736294" w:history="1">
                 <w:r>
                   <w:rPr>
                     <w:rStyle w:val="Hipervnculo"/>
@@ -1795,7 +1795,7 @@
                     <w:noProof/>
                     <w:webHidden/>
                   </w:rPr>
-                  <w:instrText xml:space="preserve"> PAGEREF _Toc243227920 \h </w:instrText>
+                  <w:instrText xml:space="preserve"> PAGEREF _Toc243736294 \h </w:instrText>
                 </w:r>
                 <w:r>
                   <w:rPr>
@@ -1838,7 +1838,7 @@
                   <w:lang w:eastAsia="es-ES"/>
                 </w:rPr>
               </w:pPr>
-              <w:hyperlink w:anchor="_Toc243227921" w:history="1">
+              <w:hyperlink w:anchor="_Toc243736295" w:history="1">
                 <w:r>
                   <w:rPr>
                     <w:rStyle w:val="Hipervnculo"/>
@@ -1866,7 +1866,7 @@
                     <w:noProof/>
                     <w:webHidden/>
                   </w:rPr>
-                  <w:instrText xml:space="preserve"> PAGEREF _Toc243227921 \h </w:instrText>
+                  <w:instrText xml:space="preserve"> PAGEREF _Toc243736295 \h </w:instrText>
                 </w:r>
                 <w:r>
                   <w:rPr>
@@ -1909,7 +1909,7 @@
                   <w:lang w:eastAsia="es-ES"/>
                 </w:rPr>
               </w:pPr>
-              <w:hyperlink w:anchor="_Toc243227922" w:history="1">
+              <w:hyperlink w:anchor="_Toc243736296" w:history="1">
                 <w:r>
                   <w:rPr>
                     <w:rStyle w:val="Hipervnculo"/>
@@ -1937,7 +1937,7 @@
                     <w:noProof/>
                     <w:webHidden/>
                   </w:rPr>
-                  <w:instrText xml:space="preserve"> PAGEREF _Toc243227922 \h </w:instrText>
+                  <w:instrText xml:space="preserve"> PAGEREF _Toc243736296 \h </w:instrText>
                 </w:r>
                 <w:r>
                   <w:rPr>
@@ -1980,7 +1980,7 @@
                   <w:lang w:eastAsia="es-ES"/>
                 </w:rPr>
               </w:pPr>
-              <w:hyperlink w:anchor="_Toc243227923" w:history="1">
+              <w:hyperlink w:anchor="_Toc243736297" w:history="1">
                 <w:r>
                   <w:rPr>
                     <w:rStyle w:val="Hipervnculo"/>
@@ -2008,7 +2008,7 @@
                     <w:noProof/>
                     <w:webHidden/>
                   </w:rPr>
-                  <w:instrText xml:space="preserve"> PAGEREF _Toc243227923 \h </w:instrText>
+                  <w:instrText xml:space="preserve"> PAGEREF _Toc243736297 \h </w:instrText>
                 </w:r>
                 <w:r>
                   <w:rPr>
@@ -2051,7 +2051,7 @@
                   <w:lang w:eastAsia="es-ES"/>
                 </w:rPr>
               </w:pPr>
-              <w:hyperlink w:anchor="_Toc243227924" w:history="1">
+              <w:hyperlink w:anchor="_Toc243736298" w:history="1">
                 <w:r>
                   <w:rPr>
                     <w:rStyle w:val="Hipervnculo"/>
@@ -2079,7 +2079,7 @@
                     <w:noProof/>
                     <w:webHidden/>
                   </w:rPr>
-                  <w:instrText xml:space="preserve"> PAGEREF _Toc243227924 \h </w:instrText>
+                  <w:instrText xml:space="preserve"> PAGEREF _Toc243736298 \h </w:instrText>
                 </w:r>
                 <w:r>
                   <w:rPr>
@@ -2122,7 +2122,7 @@
                   <w:lang w:eastAsia="es-ES"/>
                 </w:rPr>
               </w:pPr>
-              <w:hyperlink w:anchor="_Toc243227925" w:history="1">
+              <w:hyperlink w:anchor="_Toc243736299" w:history="1">
                 <w:r>
                   <w:rPr>
                     <w:rStyle w:val="Hipervnculo"/>
@@ -2150,7 +2150,7 @@
                     <w:noProof/>
                     <w:webHidden/>
                   </w:rPr>
-                  <w:instrText xml:space="preserve"> PAGEREF _Toc243227925 \h </w:instrText>
+                  <w:instrText xml:space="preserve"> PAGEREF _Toc243736299 \h </w:instrText>
                 </w:r>
                 <w:r>
                   <w:rPr>
@@ -2193,7 +2193,7 @@
                   <w:lang w:eastAsia="es-ES"/>
                 </w:rPr>
               </w:pPr>
-              <w:hyperlink w:anchor="_Toc243227926" w:history="1">
+              <w:hyperlink w:anchor="_Toc243736300" w:history="1">
                 <w:r>
                   <w:rPr>
                     <w:rStyle w:val="Hipervnculo"/>
@@ -2221,7 +2221,7 @@
                     <w:noProof/>
                     <w:webHidden/>
                   </w:rPr>
-                  <w:instrText xml:space="preserve"> PAGEREF _Toc243227926 \h </w:instrText>
+                  <w:instrText xml:space="preserve"> PAGEREF _Toc243736300 \h </w:instrText>
                 </w:r>
                 <w:r>
                   <w:rPr>
@@ -2264,7 +2264,7 @@
                   <w:lang w:eastAsia="es-ES"/>
                 </w:rPr>
               </w:pPr>
-              <w:hyperlink w:anchor="_Toc243227927" w:history="1">
+              <w:hyperlink w:anchor="_Toc243736301" w:history="1">
                 <w:r>
                   <w:rPr>
                     <w:rStyle w:val="Hipervnculo"/>
@@ -2292,7 +2292,7 @@
                     <w:noProof/>
                     <w:webHidden/>
                   </w:rPr>
-                  <w:instrText xml:space="preserve"> PAGEREF _Toc243227927 \h </w:instrText>
+                  <w:instrText xml:space="preserve"> PAGEREF _Toc243736301 \h </w:instrText>
                 </w:r>
                 <w:r>
                   <w:rPr>
@@ -2313,6 +2313,77 @@
                     <w:webHidden/>
                   </w:rPr>
                   <w:t>7</w:t>
+                </w:r>
+                <w:r>
+                  <w:rPr>
+                    <w:noProof/>
+                    <w:webHidden/>
+                  </w:rPr>
+                  <w:fldChar w:fldCharType="end"/>
+                </w:r>
+              </w:hyperlink>
+            </w:p>
+            <w:p>
+              <w:pPr>
+                <w:pStyle w:val="TDC2"/>
+                <w:tabs>
+                  <w:tab w:val="right" w:leader="dot" w:pos="8494"/>
+                </w:tabs>
+                <w:rPr>
+                  <w:rFonts w:asciiTheme="minorHAnsi" w:eastAsiaTheme="minorEastAsia" w:hAnsiTheme="minorHAnsi"/>
+                  <w:noProof/>
+                  <w:lang w:eastAsia="es-ES"/>
+                </w:rPr>
+              </w:pPr>
+              <w:hyperlink w:anchor="_Toc243736302" w:history="1">
+                <w:r>
+                  <w:rPr>
+                    <w:rStyle w:val="Hipervnculo"/>
+                    <w:noProof/>
+                    <w:lang w:eastAsia="es-ES"/>
+                  </w:rPr>
+                  <w:t>Topología y elementos</w:t>
+                </w:r>
+                <w:r>
+                  <w:rPr>
+                    <w:noProof/>
+                    <w:webHidden/>
+                  </w:rPr>
+                  <w:tab/>
+                </w:r>
+                <w:r>
+                  <w:rPr>
+                    <w:noProof/>
+                    <w:webHidden/>
+                  </w:rPr>
+                  <w:fldChar w:fldCharType="begin"/>
+                </w:r>
+                <w:r>
+                  <w:rPr>
+                    <w:noProof/>
+                    <w:webHidden/>
+                  </w:rPr>
+                  <w:instrText xml:space="preserve"> PAGEREF _Toc243736302 \h </w:instrText>
+                </w:r>
+                <w:r>
+                  <w:rPr>
+                    <w:noProof/>
+                    <w:webHidden/>
+                  </w:rPr>
+                </w:r>
+                <w:r>
+                  <w:rPr>
+                    <w:noProof/>
+                    <w:webHidden/>
+                  </w:rPr>
+                  <w:fldChar w:fldCharType="separate"/>
+                </w:r>
+                <w:r>
+                  <w:rPr>
+                    <w:noProof/>
+                    <w:webHidden/>
+                  </w:rPr>
+                  <w:t>8</w:t>
                 </w:r>
                 <w:r>
                   <w:rPr>
@@ -2367,7 +2438,7 @@
               <w:lang w:eastAsia="es-ES"/>
             </w:rPr>
           </w:pPr>
-          <w:bookmarkStart w:id="0" w:name="_Toc243227914"/>
+          <w:bookmarkStart w:id="0" w:name="_Toc243736288"/>
           <w:r>
             <w:rPr>
               <w:rFonts w:eastAsiaTheme="minorEastAsia"/>
@@ -2562,7 +2633,7 @@
               <w:lang w:eastAsia="es-ES"/>
             </w:rPr>
           </w:pPr>
-          <w:bookmarkStart w:id="1" w:name="_Toc243227915"/>
+          <w:bookmarkStart w:id="1" w:name="_Toc243736289"/>
           <w:r>
             <w:rPr>
               <w:lang w:eastAsia="es-ES"/>
@@ -3169,7 +3240,7 @@
               <w:lang w:eastAsia="es-ES"/>
             </w:rPr>
           </w:pPr>
-          <w:bookmarkStart w:id="2" w:name="_Toc243227916"/>
+          <w:bookmarkStart w:id="2" w:name="_Toc243736290"/>
           <w:r>
             <w:rPr>
               <w:lang w:eastAsia="es-ES"/>
@@ -3219,7 +3290,7 @@
           <w:lang w:eastAsia="es-ES"/>
         </w:rPr>
       </w:pPr>
-      <w:bookmarkStart w:id="3" w:name="_Toc243227917"/>
+      <w:bookmarkStart w:id="3" w:name="_Toc243736291"/>
       <w:r>
         <w:rPr>
           <w:lang w:eastAsia="es-ES"/>
@@ -3256,21 +3327,7 @@
         <w:rPr>
           <w:lang w:eastAsia="es-ES"/>
         </w:rPr>
-        <w:t xml:space="preserve">, en caso de fallar uno se podrían mover las </w:t>
-      </w:r>
-      <w:proofErr w:type="spellStart"/>
-      <w:r>
-        <w:rPr>
-          <w:lang w:eastAsia="es-ES"/>
-        </w:rPr>
-        <w:t>maquinas</w:t>
-      </w:r>
-      <w:proofErr w:type="spellEnd"/>
-      <w:r>
-        <w:rPr>
-          <w:lang w:eastAsia="es-ES"/>
-        </w:rPr>
-        <w:t xml:space="preserve"> virtuales y hacer instantáneas antes de cada </w:t>
+        <w:t xml:space="preserve">, en caso de fallar uno se podrían mover las maquinas virtuales y hacer instantáneas antes de cada </w:t>
       </w:r>
       <w:r>
         <w:rPr>
@@ -3905,19 +3962,11 @@
                 <w:lang w:eastAsia="es-ES"/>
               </w:rPr>
             </w:pPr>
-            <w:proofErr w:type="spellStart"/>
-            <w:r>
-              <w:rPr>
-                <w:lang w:eastAsia="es-ES"/>
-              </w:rPr>
-              <w:t>Zabbix</w:t>
-            </w:r>
-            <w:proofErr w:type="spellEnd"/>
-            <w:r>
-              <w:rPr>
-                <w:lang w:eastAsia="es-ES"/>
-              </w:rPr>
-              <w:t>, SIEM ligero, GLPI</w:t>
+            <w:r>
+              <w:rPr>
+                <w:lang w:eastAsia="es-ES"/>
+              </w:rPr>
+              <w:t>Zabbix, SIEM ligero, GLPI</w:t>
             </w:r>
           </w:p>
         </w:tc>
@@ -4109,7 +4158,7 @@
           <w:lang w:eastAsia="es-ES"/>
         </w:rPr>
       </w:pPr>
-      <w:bookmarkStart w:id="4" w:name="_Toc243227918"/>
+      <w:bookmarkStart w:id="4" w:name="_Toc243736292"/>
       <w:r>
         <w:rPr>
           <w:lang w:eastAsia="es-ES"/>
@@ -4124,14 +4173,12 @@
           <w:lang w:eastAsia="es-ES"/>
         </w:rPr>
       </w:pPr>
-      <w:proofErr w:type="spellStart"/>
       <w:r>
         <w:rPr>
           <w:lang w:eastAsia="es-ES"/>
         </w:rPr>
-        <w:t>PostgresSQL</w:t>
+        <w:t>PostgreSQL</w:t>
       </w:r>
-      <w:proofErr w:type="spellEnd"/>
       <w:r>
         <w:rPr>
           <w:lang w:eastAsia="es-ES"/>
@@ -4213,7 +4260,7 @@
           <w:lang w:eastAsia="es-ES"/>
         </w:rPr>
       </w:pPr>
-      <w:bookmarkStart w:id="5" w:name="_Toc243227919"/>
+      <w:bookmarkStart w:id="5" w:name="_Toc243736293"/>
       <w:r>
         <w:rPr>
           <w:lang w:eastAsia="es-ES"/>
@@ -4510,19 +4557,11 @@
                 <w:lang w:eastAsia="es-ES"/>
               </w:rPr>
             </w:pPr>
-            <w:proofErr w:type="gramStart"/>
-            <w:r>
-              <w:rPr>
-                <w:lang w:eastAsia="es-ES"/>
-              </w:rPr>
-              <w:t>Total</w:t>
-            </w:r>
-            <w:proofErr w:type="gramEnd"/>
-            <w:r>
-              <w:rPr>
-                <w:lang w:eastAsia="es-ES"/>
-              </w:rPr>
-              <w:t xml:space="preserve"> útil</w:t>
+            <w:r>
+              <w:rPr>
+                <w:lang w:eastAsia="es-ES"/>
+              </w:rPr>
+              <w:t>Total útil</w:t>
             </w:r>
           </w:p>
         </w:tc>
@@ -4560,14 +4599,12 @@
               </w:rPr>
               <w:t xml:space="preserve">Datos actuales </w:t>
             </w:r>
-            <w:proofErr w:type="spellStart"/>
-            <w:r>
-              <w:rPr>
-                <w:lang w:eastAsia="es-ES"/>
-              </w:rPr>
-              <w:t>mas</w:t>
-            </w:r>
-            <w:proofErr w:type="spellEnd"/>
+            <w:r>
+              <w:rPr>
+                <w:lang w:eastAsia="es-ES"/>
+              </w:rPr>
+              <w:t>más</w:t>
+            </w:r>
             <w:r>
               <w:rPr>
                 <w:lang w:eastAsia="es-ES"/>
@@ -4604,7 +4641,7 @@
           <w:lang w:eastAsia="es-ES"/>
         </w:rPr>
       </w:pPr>
-      <w:bookmarkStart w:id="6" w:name="_Toc243227920"/>
+      <w:bookmarkStart w:id="6" w:name="_Toc243736294"/>
       <w:r>
         <w:rPr>
           <w:lang w:eastAsia="es-ES"/>
@@ -4658,21 +4695,7 @@
         <w:rPr>
           <w:lang w:eastAsia="es-ES"/>
         </w:rPr>
-        <w:t xml:space="preserve"> además de filtrado de contenido y DNS para bloquear </w:t>
-      </w:r>
-      <w:proofErr w:type="gramStart"/>
-      <w:r>
-        <w:rPr>
-          <w:lang w:eastAsia="es-ES"/>
-        </w:rPr>
-        <w:t>malware</w:t>
-      </w:r>
-      <w:proofErr w:type="gramEnd"/>
-      <w:r>
-        <w:rPr>
-          <w:lang w:eastAsia="es-ES"/>
-        </w:rPr>
-        <w:t xml:space="preserve"> y phishing.</w:t>
+        <w:t xml:space="preserve"> además de filtrado de contenido y DNS para bloquear malware y phishing.</w:t>
       </w:r>
     </w:p>
     <w:p>
@@ -4789,7 +4812,7 @@
           <w:lang w:eastAsia="es-ES"/>
         </w:rPr>
       </w:pPr>
-      <w:bookmarkStart w:id="7" w:name="_Toc243227921"/>
+      <w:bookmarkStart w:id="7" w:name="_Toc243736295"/>
       <w:r>
         <w:rPr>
           <w:lang w:eastAsia="es-ES"/>
@@ -4896,28 +4919,12 @@
                 <w:lang w:eastAsia="es-ES"/>
               </w:rPr>
             </w:pPr>
-            <w:proofErr w:type="spellStart"/>
-            <w:r>
-              <w:rPr>
-                <w:lang w:eastAsia="es-ES"/>
-              </w:rPr>
-              <w:t>Aules</w:t>
-            </w:r>
-            <w:proofErr w:type="spellEnd"/>
-            <w:r>
-              <w:rPr>
-                <w:lang w:eastAsia="es-ES"/>
-              </w:rPr>
-              <w:t>/</w:t>
-            </w:r>
-            <w:proofErr w:type="spellStart"/>
-            <w:r>
-              <w:rPr>
-                <w:lang w:eastAsia="es-ES"/>
-              </w:rPr>
-              <w:t>Itaca</w:t>
-            </w:r>
-            <w:proofErr w:type="spellEnd"/>
+            <w:r>
+              <w:rPr>
+                <w:lang w:eastAsia="es-ES"/>
+              </w:rPr>
+              <w:t>Aules/Itaca</w:t>
+            </w:r>
           </w:p>
         </w:tc>
         <w:tc>
@@ -4974,14 +4981,12 @@
               </w:rPr>
               <w:t xml:space="preserve">Suite en la </w:t>
             </w:r>
-            <w:proofErr w:type="spellStart"/>
             <w:r>
               <w:rPr>
                 <w:lang w:val="fr-FR" w:eastAsia="es-ES"/>
               </w:rPr>
               <w:t>nube</w:t>
             </w:r>
-            <w:proofErr w:type="spellEnd"/>
             <w:r>
               <w:rPr>
                 <w:lang w:val="fr-FR" w:eastAsia="es-ES"/>
@@ -5346,7 +5351,7 @@
           <w:lang w:eastAsia="es-ES"/>
         </w:rPr>
       </w:pPr>
-      <w:bookmarkStart w:id="8" w:name="_Toc243227922"/>
+      <w:bookmarkStart w:id="8" w:name="_Toc243736296"/>
       <w:r>
         <w:rPr>
           <w:lang w:eastAsia="es-ES"/>
@@ -5399,7 +5404,7 @@
           <w:lang w:eastAsia="es-ES"/>
         </w:rPr>
       </w:pPr>
-      <w:bookmarkStart w:id="9" w:name="_Toc243227923"/>
+      <w:bookmarkStart w:id="9" w:name="_Toc243736297"/>
       <w:r>
         <w:rPr>
           <w:lang w:eastAsia="es-ES"/>
@@ -5534,19 +5539,17 @@
         </w:rPr>
         <w:t xml:space="preserve">Latencia y servicios locales: </w:t>
       </w:r>
-      <w:proofErr w:type="spellStart"/>
       <w:r>
         <w:rPr>
           <w:lang w:eastAsia="es-ES"/>
         </w:rPr>
-        <w:t>Wi</w:t>
+        <w:t>Wifi</w:t>
       </w:r>
-      <w:proofErr w:type="spellEnd"/>
       <w:r>
         <w:rPr>
           <w:lang w:eastAsia="es-ES"/>
         </w:rPr>
-        <w:t>-Fi, impresión, cámaras y control de accesos son físicos y exigen respuesta inmediata.</w:t>
+        <w:t>, impresión, cámaras y control de accesos son físicos y exigen respuesta inmediata.</w:t>
       </w:r>
     </w:p>
     <w:p>
@@ -5599,7 +5602,7 @@
           <w:lang w:eastAsia="es-ES"/>
         </w:rPr>
       </w:pPr>
-      <w:bookmarkStart w:id="10" w:name="_Toc243227924"/>
+      <w:bookmarkStart w:id="10" w:name="_Toc243736298"/>
       <w:r>
         <w:rPr>
           <w:lang w:eastAsia="es-ES"/>
@@ -5706,19 +5709,11 @@
                 <w:lang w:eastAsia="es-ES"/>
               </w:rPr>
             </w:pPr>
-            <w:proofErr w:type="spellStart"/>
-            <w:r>
-              <w:rPr>
-                <w:lang w:eastAsia="es-ES"/>
-              </w:rPr>
-              <w:t>On</w:t>
-            </w:r>
-            <w:proofErr w:type="spellEnd"/>
-            <w:r>
-              <w:rPr>
-                <w:lang w:eastAsia="es-ES"/>
-              </w:rPr>
-              <w:t>-pr</w:t>
+            <w:r>
+              <w:rPr>
+                <w:lang w:eastAsia="es-ES"/>
+              </w:rPr>
+              <w:t>On-pr</w:t>
             </w:r>
             <w:r>
               <w:rPr>
@@ -5990,14 +5985,12 @@
                 <w:lang w:eastAsia="es-ES"/>
               </w:rPr>
             </w:pPr>
-            <w:proofErr w:type="spellStart"/>
             <w:r>
               <w:rPr>
                 <w:lang w:eastAsia="es-ES"/>
               </w:rPr>
               <w:t>Multicloud</w:t>
             </w:r>
-            <w:proofErr w:type="spellEnd"/>
           </w:p>
         </w:tc>
         <w:tc>
@@ -6087,7 +6080,7 @@
           <w:lang w:eastAsia="es-ES"/>
         </w:rPr>
       </w:pPr>
-      <w:bookmarkStart w:id="11" w:name="_Toc243227925"/>
+      <w:bookmarkStart w:id="11" w:name="_Toc243736299"/>
       <w:r>
         <w:rPr>
           <w:lang w:eastAsia="es-ES"/>
@@ -6289,21 +6282,7 @@
               <w:rPr>
                 <w:lang w:eastAsia="es-ES"/>
               </w:rPr>
-              <w:t>Nube (</w:t>
-            </w:r>
-            <w:proofErr w:type="spellStart"/>
-            <w:r>
-              <w:rPr>
-                <w:lang w:eastAsia="es-ES"/>
-              </w:rPr>
-              <w:t>Aules</w:t>
-            </w:r>
-            <w:proofErr w:type="spellEnd"/>
-            <w:r>
-              <w:rPr>
-                <w:lang w:eastAsia="es-ES"/>
-              </w:rPr>
-              <w:t xml:space="preserve"> de la </w:t>
+              <w:t xml:space="preserve">Nube (Aules de la </w:t>
             </w:r>
             <w:r>
               <w:rPr>
@@ -6465,14 +6444,12 @@
               </w:rPr>
               <w:t xml:space="preserve">La web no es </w:t>
             </w:r>
-            <w:proofErr w:type="spellStart"/>
-            <w:r>
-              <w:rPr>
-                <w:lang w:eastAsia="es-ES"/>
-              </w:rPr>
-              <w:t>critica</w:t>
-            </w:r>
-            <w:proofErr w:type="spellEnd"/>
+            <w:r>
+              <w:rPr>
+                <w:lang w:eastAsia="es-ES"/>
+              </w:rPr>
+              <w:t>crítica</w:t>
+            </w:r>
             <w:r>
               <w:rPr>
                 <w:lang w:eastAsia="es-ES"/>
@@ -6551,30 +6528,14 @@
               <w:rPr>
                 <w:lang w:eastAsia="es-ES"/>
               </w:rPr>
-              <w:t xml:space="preserve"> o </w:t>
-            </w:r>
-            <w:proofErr w:type="spellStart"/>
-            <w:r>
-              <w:rPr>
-                <w:lang w:eastAsia="es-ES"/>
-              </w:rPr>
-              <w:t>ransomware</w:t>
-            </w:r>
-            <w:proofErr w:type="spellEnd"/>
-            <w:r>
-              <w:rPr>
-                <w:lang w:eastAsia="es-ES"/>
-              </w:rPr>
-              <w:t xml:space="preserve"> porque esta fuera del </w:t>
-            </w:r>
-            <w:proofErr w:type="spellStart"/>
-            <w:r>
-              <w:rPr>
-                <w:lang w:eastAsia="es-ES"/>
-              </w:rPr>
-              <w:t>edifício</w:t>
-            </w:r>
-            <w:proofErr w:type="spellEnd"/>
+              <w:t xml:space="preserve"> o ransomware porque esta fuera del </w:t>
+            </w:r>
+            <w:r>
+              <w:rPr>
+                <w:lang w:eastAsia="es-ES"/>
+              </w:rPr>
+              <w:t>edificio</w:t>
+            </w:r>
             <w:r>
               <w:rPr>
                 <w:lang w:eastAsia="es-ES"/>
@@ -6655,16 +6616,8 @@
               <w:rPr>
                 <w:lang w:eastAsia="es-ES"/>
               </w:rPr>
-              <w:t xml:space="preserve">Directorio, DNS, DHCP y </w:t>
-            </w:r>
-            <w:proofErr w:type="spellStart"/>
-            <w:r>
-              <w:rPr>
-                <w:lang w:eastAsia="es-ES"/>
-              </w:rPr>
-              <w:t>radius</w:t>
-            </w:r>
-            <w:proofErr w:type="spellEnd"/>
+              <w:t>Directorio, DNS, DHCP y radius</w:t>
+            </w:r>
           </w:p>
         </w:tc>
         <w:tc>
@@ -6886,7 +6839,7 @@
           <w:lang w:eastAsia="es-ES"/>
         </w:rPr>
       </w:pPr>
-      <w:bookmarkStart w:id="12" w:name="_Toc243227926"/>
+      <w:bookmarkStart w:id="12" w:name="_Toc243736300"/>
       <w:r>
         <w:rPr>
           <w:lang w:eastAsia="es-ES"/>
@@ -6925,14 +6878,12 @@
         </w:rPr>
         <w:t xml:space="preserve">, se hacen exportaciones periódicas de datos y se exigen </w:t>
       </w:r>
-      <w:proofErr w:type="spellStart"/>
       <w:r>
         <w:rPr>
           <w:lang w:eastAsia="es-ES"/>
         </w:rPr>
-        <w:t>clausulas</w:t>
+        <w:t>cláusulas</w:t>
       </w:r>
-      <w:proofErr w:type="spellEnd"/>
       <w:r>
         <w:rPr>
           <w:lang w:eastAsia="es-ES"/>
@@ -7025,7 +6976,7 @@
           <w:lang w:eastAsia="es-ES"/>
         </w:rPr>
       </w:pPr>
-      <w:bookmarkStart w:id="13" w:name="_Toc243227927"/>
+      <w:bookmarkStart w:id="13" w:name="_Toc243736301"/>
       <w:r>
         <w:rPr>
           <w:lang w:eastAsia="es-ES"/>
@@ -7068,21 +7019,7 @@
         <w:rPr>
           <w:lang w:eastAsia="es-ES"/>
         </w:rPr>
-        <w:t xml:space="preserve"> llamados </w:t>
-      </w:r>
-      <w:proofErr w:type="spellStart"/>
-      <w:r>
-        <w:rPr>
-          <w:lang w:eastAsia="es-ES"/>
-        </w:rPr>
-        <w:t>ONetMap</w:t>
-      </w:r>
-      <w:proofErr w:type="spellEnd"/>
-      <w:r>
-        <w:rPr>
-          <w:lang w:eastAsia="es-ES"/>
-        </w:rPr>
-        <w:t xml:space="preserve"> y se adjunta como figura 1</w:t>
+        <w:t xml:space="preserve"> llamados ONetMap y se adjunta como figura</w:t>
       </w:r>
       <w:r>
         <w:rPr>
@@ -7241,12 +7178,14 @@
           <w:lang w:eastAsia="es-ES"/>
         </w:rPr>
       </w:pPr>
+      <w:bookmarkStart w:id="14" w:name="_Toc243736302"/>
       <w:r>
         <w:rPr>
           <w:lang w:eastAsia="es-ES"/>
         </w:rPr>
         <w:t>Topología y elementos</w:t>
       </w:r>
+      <w:bookmarkEnd w:id="14"/>
     </w:p>
     <w:tbl>
       <w:tblPr>
@@ -7331,21 +7270,7 @@
               <w:rPr>
                 <w:lang w:val="it-IT" w:eastAsia="es-ES"/>
               </w:rPr>
-              <w:t>ISP A (fibra 1 Gbps) e ISP B (</w:t>
-            </w:r>
-            <w:proofErr w:type="spellStart"/>
-            <w:r>
-              <w:rPr>
-                <w:lang w:val="it-IT" w:eastAsia="es-ES"/>
-              </w:rPr>
-              <w:t>respaldo</w:t>
-            </w:r>
-            <w:proofErr w:type="spellEnd"/>
-            <w:r>
-              <w:rPr>
-                <w:lang w:val="it-IT" w:eastAsia="es-ES"/>
-              </w:rPr>
-              <w:t xml:space="preserve"> 500 Mbps)</w:t>
+              <w:t>ISP A (fibra 1 Gbps) e ISP B (respaldo 500 Mbps)</w:t>
             </w:r>
           </w:p>
         </w:tc>
@@ -7597,41 +7522,13 @@
               <w:rPr>
                 <w:lang w:eastAsia="es-ES"/>
               </w:rPr>
-              <w:t xml:space="preserve">Dos switches en </w:t>
-            </w:r>
-            <w:proofErr w:type="spellStart"/>
-            <w:r>
-              <w:rPr>
-                <w:lang w:eastAsia="es-ES"/>
-              </w:rPr>
-              <w:t>stack</w:t>
-            </w:r>
-            <w:proofErr w:type="spellEnd"/>
-            <w:r>
-              <w:rPr>
-                <w:lang w:eastAsia="es-ES"/>
-              </w:rPr>
-              <w:t xml:space="preserve"> que conectan los nodos</w:t>
-            </w:r>
-            <w:r>
-              <w:rPr>
-                <w:lang w:eastAsia="es-ES"/>
-              </w:rPr>
-              <w:t xml:space="preserve">, los NAS, el NVR y el controlador </w:t>
-            </w:r>
-            <w:proofErr w:type="spellStart"/>
-            <w:r>
-              <w:rPr>
-                <w:lang w:eastAsia="es-ES"/>
-              </w:rPr>
-              <w:t>WiFi</w:t>
-            </w:r>
-            <w:proofErr w:type="spellEnd"/>
-            <w:r>
-              <w:rPr>
-                <w:lang w:eastAsia="es-ES"/>
-              </w:rPr>
-              <w:t>.</w:t>
+              <w:t>Dos switches en stack que conectan los nodos</w:t>
+            </w:r>
+            <w:r>
+              <w:rPr>
+                <w:lang w:eastAsia="es-ES"/>
+              </w:rPr>
+              <w:t>, los NAS, el NVR y el controlador WiFi.</w:t>
             </w:r>
           </w:p>
         </w:tc>
@@ -7705,21 +7602,7 @@
               <w:rPr>
                 <w:lang w:eastAsia="es-ES"/>
               </w:rPr>
-              <w:t xml:space="preserve">Switches de acceso </w:t>
-            </w:r>
-            <w:proofErr w:type="spellStart"/>
-            <w:r>
-              <w:rPr>
-                <w:lang w:eastAsia="es-ES"/>
-              </w:rPr>
-              <w:t>PoE</w:t>
-            </w:r>
-            <w:proofErr w:type="spellEnd"/>
-            <w:r>
-              <w:rPr>
-                <w:lang w:eastAsia="es-ES"/>
-              </w:rPr>
-              <w:t xml:space="preserve"> + por planta y pabellón.</w:t>
+              <w:t>Switches de acceso PoE + por planta y pabellón.</w:t>
             </w:r>
           </w:p>
         </w:tc>
@@ -7789,19 +7672,11 @@
                 <w:lang w:eastAsia="es-ES"/>
               </w:rPr>
             </w:pPr>
-            <w:proofErr w:type="spellStart"/>
-            <w:r>
-              <w:rPr>
-                <w:lang w:eastAsia="es-ES"/>
-              </w:rPr>
-              <w:t>WiFi</w:t>
-            </w:r>
-            <w:proofErr w:type="spellEnd"/>
-            <w:r>
-              <w:rPr>
-                <w:lang w:eastAsia="es-ES"/>
-              </w:rPr>
-              <w:t xml:space="preserve"> de alta densidad gestionado desde un controlador.</w:t>
+            <w:r>
+              <w:rPr>
+                <w:lang w:eastAsia="es-ES"/>
+              </w:rPr>
+              <w:t>WiFi de alta densidad gestionado desde un controlador.</w:t>
             </w:r>
           </w:p>
         </w:tc>
@@ -7960,19 +7835,11 @@
                 <w:lang w:eastAsia="es-ES"/>
               </w:rPr>
             </w:pPr>
-            <w:proofErr w:type="spellStart"/>
-            <w:r>
-              <w:rPr>
-                <w:lang w:eastAsia="es-ES"/>
-              </w:rPr>
-              <w:t>Aules</w:t>
-            </w:r>
-            <w:proofErr w:type="spellEnd"/>
-            <w:r>
-              <w:rPr>
-                <w:lang w:eastAsia="es-ES"/>
-              </w:rPr>
-              <w:t>, ITACA, web alo</w:t>
+            <w:r>
+              <w:rPr>
+                <w:lang w:eastAsia="es-ES"/>
+              </w:rPr>
+              <w:t>Aules, ITACA, web alo</w:t>
             </w:r>
             <w:r>
               <w:rPr>
@@ -8052,21 +7919,7 @@
               <w:rPr>
                 <w:lang w:eastAsia="es-ES"/>
               </w:rPr>
-              <w:t xml:space="preserve"> controlador </w:t>
-            </w:r>
-            <w:proofErr w:type="spellStart"/>
-            <w:r>
-              <w:rPr>
-                <w:lang w:eastAsia="es-ES"/>
-              </w:rPr>
-              <w:t>WiFi</w:t>
-            </w:r>
-            <w:proofErr w:type="spellEnd"/>
-            <w:r>
-              <w:rPr>
-                <w:lang w:eastAsia="es-ES"/>
-              </w:rPr>
-              <w:t>)</w:t>
+              <w:t xml:space="preserve"> controlador WiFi)</w:t>
             </w:r>
           </w:p>
         </w:tc>
@@ -8102,183 +7955,12 @@
               <w:rPr>
                 <w:lang w:eastAsia="es-ES"/>
               </w:rPr>
-              <w:t xml:space="preserve">Agrupa lo que debe funcionar sin internet en una sala con SAI y refrigeración, los servicios de la tabla 1.1 (directorio, DNS/DHCP, </w:t>
-            </w:r>
-            <w:proofErr w:type="spellStart"/>
-            <w:r>
-              <w:rPr>
-                <w:lang w:eastAsia="es-ES"/>
-              </w:rPr>
-              <w:t>Radius</w:t>
-            </w:r>
-            <w:proofErr w:type="spellEnd"/>
-            <w:r>
-              <w:rPr>
-                <w:lang w:eastAsia="es-ES"/>
-              </w:rPr>
-              <w:t>/NAC, ficheros…) se ejecutan como máquinas virtuales dentro de los tres nodos, por eso no se dibujan por separado.</w:t>
+              <w:t>Agrupa lo que debe funcionar sin internet en una sala con SAI y refrigeración, los servicios de la tabla 1.1 (directorio, DNS/DHCP, Radius/NAC, ficheros…) se ejecutan como máquinas virtuales dentro de los tres nodos, por eso no se dibujan por separado.</w:t>
             </w:r>
           </w:p>
         </w:tc>
       </w:tr>
     </w:tbl>
-    <w:p>
-      <w:pPr>
-        <w:rPr>
-          <w:lang w:eastAsia="es-ES"/>
-        </w:rPr>
-      </w:pPr>
-    </w:p>
-    <w:p>
-      <w:pPr>
-        <w:rPr>
-          <w:lang w:eastAsia="es-ES"/>
-        </w:rPr>
-      </w:pPr>
-      <w:r>
-        <w:rPr>
-          <w:lang w:eastAsia="es-ES"/>
-        </w:rPr>
-        <w:t>Es necesario meter</w:t>
-      </w:r>
-    </w:p>
-    <w:p>
-      <w:pPr>
-        <w:rPr>
-          <w:b/>
-          <w:bCs/>
-          <w:lang w:eastAsia="es-ES"/>
-        </w:rPr>
-      </w:pPr>
-      <w:r>
-        <w:rPr>
-          <w:b/>
-          <w:bCs/>
-          <w:lang w:eastAsia="es-ES"/>
-        </w:rPr>
-        <w:t>3.2 Segmentación en VLAN y direccionamiento</w:t>
-      </w:r>
-    </w:p>
-    <w:p>
-      <w:pPr>
-        <w:rPr>
-          <w:b/>
-          <w:bCs/>
-          <w:lang w:eastAsia="es-ES"/>
-        </w:rPr>
-      </w:pPr>
-      <w:r>
-        <w:rPr>
-          <w:b/>
-          <w:bCs/>
-          <w:lang w:eastAsia="es-ES"/>
-        </w:rPr>
-        <w:t xml:space="preserve">3.3 </w:t>
-      </w:r>
-      <w:proofErr w:type="spellStart"/>
-      <w:r>
-        <w:rPr>
-          <w:b/>
-          <w:bCs/>
-          <w:lang w:eastAsia="es-ES"/>
-        </w:rPr>
-        <w:t>Wi</w:t>
-      </w:r>
-      <w:proofErr w:type="spellEnd"/>
-      <w:r>
-        <w:rPr>
-          <w:b/>
-          <w:bCs/>
-          <w:lang w:eastAsia="es-ES"/>
-        </w:rPr>
-        <w:t>-Fi</w:t>
-      </w:r>
-    </w:p>
-    <w:p>
-      <w:pPr>
-        <w:rPr>
-          <w:b/>
-          <w:bCs/>
-          <w:lang w:eastAsia="es-ES"/>
-        </w:rPr>
-      </w:pPr>
-      <w:r>
-        <w:rPr>
-          <w:b/>
-          <w:bCs/>
-          <w:lang w:eastAsia="es-ES"/>
-        </w:rPr>
-        <w:t>3.4 Servicios de red</w:t>
-      </w:r>
-    </w:p>
-    <w:p>
-      <w:pPr>
-        <w:rPr>
-          <w:b/>
-          <w:bCs/>
-          <w:lang w:eastAsia="es-ES"/>
-        </w:rPr>
-      </w:pPr>
-      <w:r>
-        <w:rPr>
-          <w:b/>
-          <w:bCs/>
-          <w:lang w:eastAsia="es-ES"/>
-        </w:rPr>
-        <w:t>3.5 Políticas de seguridad entre VLAN</w:t>
-      </w:r>
-    </w:p>
-    <w:p>
-      <w:pPr>
-        <w:rPr>
-          <w:b/>
-          <w:bCs/>
-          <w:lang w:eastAsia="es-ES"/>
-        </w:rPr>
-      </w:pPr>
-      <w:r>
-        <w:rPr>
-          <w:b/>
-          <w:bCs/>
-          <w:lang w:eastAsia="es-ES"/>
-        </w:rPr>
-        <w:t>3.6 Alta disponibilidad y continuidad</w:t>
-      </w:r>
-    </w:p>
-    <w:p>
-      <w:pPr>
-        <w:rPr>
-          <w:b/>
-          <w:bCs/>
-          <w:lang w:eastAsia="es-ES"/>
-        </w:rPr>
-      </w:pPr>
-      <w:r>
-        <w:rPr>
-          <w:b/>
-          <w:bCs/>
-          <w:lang w:eastAsia="es-ES"/>
-        </w:rPr>
-        <w:t>3.7 Alcance del esquema</w:t>
-      </w:r>
-    </w:p>
-    <w:p>
-      <w:pPr>
-        <w:rPr>
-          <w:b/>
-          <w:bCs/>
-          <w:lang w:eastAsia="es-ES"/>
-        </w:rPr>
-      </w:pPr>
-      <w:r>
-        <w:rPr>
-          <w:b/>
-          <w:bCs/>
-          <w:lang w:eastAsia="es-ES"/>
-        </w:rPr>
-        <w:t>4. Seguridad, protección de datos y operación</w:t>
-      </w:r>
-    </w:p>
     <w:p>
       <w:pPr>
         <w:rPr>
@@ -9521,6 +9203,7 @@
   <w:style w:type="character" w:default="1" w:styleId="Fuentedeprrafopredeter">
     <w:name w:val="Default Paragraph Font"/>
     <w:uiPriority w:val="1"/>
+    <w:semiHidden/>
     <w:unhideWhenUsed/>
   </w:style>
   <w:style w:type="table" w:default="1" w:styleId="Tablanormal">

</xml_diff>